<commit_message>
fix: typo in the docs
</commit_message>
<xml_diff>
--- a/docs/Laporan.docx
+++ b/docs/Laporan.docx
@@ -6101,15 +6101,7 @@
                   <w:sz w:val="24"/>
                   <w:szCs w:val="24"/>
                 </w:rPr>
-                <m:t>ukuran data awa</m:t>
-              </m:r>
-              <m:r>
-                <w:rPr>
-                  <w:rFonts w:ascii="Cambria Math" w:hAnsi="Cambria Math" w:cs="Times New Roman"/>
-                  <w:sz w:val="24"/>
-                  <w:szCs w:val="24"/>
-                </w:rPr>
-                <m:t>l</m:t>
+                <m:t>ukuran data awal</m:t>
               </m:r>
             </m:num>
             <m:den>
@@ -6488,7 +6480,7 @@
                 <w:szCs w:val="24"/>
                 <w:vertAlign w:val="superscript"/>
               </w:rPr>
-              <w:t>4</w:t>
+              <w:t>-4</w:t>
             </w:r>
             <w:r>
               <w:rPr>
@@ -6573,7 +6565,7 @@
                 <w:szCs w:val="24"/>
                 <w:vertAlign w:val="superscript"/>
               </w:rPr>
-              <w:t>4</w:t>
+              <w:t>-4</w:t>
             </w:r>
             <w:r>
               <w:rPr>
@@ -6699,7 +6691,7 @@
                 <w:szCs w:val="24"/>
                 <w:vertAlign w:val="superscript"/>
               </w:rPr>
-              <w:t>4</w:t>
+              <w:t>-4</w:t>
             </w:r>
             <w:r>
               <w:rPr>
@@ -6776,7 +6768,7 @@
                 <w:szCs w:val="24"/>
                 <w:vertAlign w:val="superscript"/>
               </w:rPr>
-              <w:t>4</w:t>
+              <w:t>-4</w:t>
             </w:r>
             <w:r>
               <w:rPr>
@@ -8301,7 +8293,7 @@
           <w:sz w:val="24"/>
           <w:szCs w:val="24"/>
         </w:rPr>
-        <w:t>cepat</w:t>
+        <w:t>lambat</w:t>
       </w:r>
       <w:proofErr w:type="spellEnd"/>
       <w:r>
@@ -8802,7 +8794,43 @@
           <w:sz w:val="24"/>
           <w:szCs w:val="24"/>
         </w:rPr>
-        <w:t xml:space="preserve">, yang </w:t>
+        <w:t xml:space="preserve">. Hal </w:t>
+      </w:r>
+      <w:proofErr w:type="spellStart"/>
+      <w:r>
+        <w:rPr>
+          <w:rFonts w:ascii="Times New Roman" w:hAnsi="Times New Roman" w:cs="Times New Roman"/>
+          <w:sz w:val="24"/>
+          <w:szCs w:val="24"/>
+        </w:rPr>
+        <w:t>ini</w:t>
+      </w:r>
+      <w:proofErr w:type="spellEnd"/>
+      <w:r>
+        <w:rPr>
+          <w:rFonts w:ascii="Times New Roman" w:hAnsi="Times New Roman" w:cs="Times New Roman"/>
+          <w:sz w:val="24"/>
+          <w:szCs w:val="24"/>
+        </w:rPr>
+        <w:t xml:space="preserve"> </w:t>
+      </w:r>
+      <w:proofErr w:type="spellStart"/>
+      <w:r>
+        <w:rPr>
+          <w:rFonts w:ascii="Times New Roman" w:hAnsi="Times New Roman" w:cs="Times New Roman"/>
+          <w:sz w:val="24"/>
+          <w:szCs w:val="24"/>
+        </w:rPr>
+        <w:t>tentunya</w:t>
+      </w:r>
+      <w:proofErr w:type="spellEnd"/>
+      <w:r>
+        <w:rPr>
+          <w:rFonts w:ascii="Times New Roman" w:hAnsi="Times New Roman" w:cs="Times New Roman"/>
+          <w:sz w:val="24"/>
+          <w:szCs w:val="24"/>
+        </w:rPr>
+        <w:t xml:space="preserve"> </w:t>
       </w:r>
       <w:proofErr w:type="spellStart"/>
       <w:r>
@@ -9714,6 +9742,7 @@
   <w:style w:type="character" w:default="1" w:styleId="DefaultParagraphFont">
     <w:name w:val="Default Paragraph Font"/>
     <w:uiPriority w:val="1"/>
+    <w:semiHidden/>
     <w:unhideWhenUsed/>
   </w:style>
   <w:style w:type="table" w:default="1" w:styleId="TableNormal">

</xml_diff>